<commit_message>
Keep working on my new report.
</commit_message>
<xml_diff>
--- a/Weekly reports/Week 6/Report.docx
+++ b/Weekly reports/Week 6/Report.docx
@@ -96,6 +96,42 @@
           <w:lang w:val="en-US"/>
         </w:rPr>
         <w:t xml:space="preserve"> After completing the</w:t>
+      </w:r>
+      <w:r>
+        <w:rPr>
+          <w:lang w:val="en-US"/>
+        </w:rPr>
+        <w:t xml:space="preserve"> Target GPA Solver</w:t>
+      </w:r>
+      <w:r>
+        <w:rPr>
+          <w:lang w:val="en-US"/>
+        </w:rPr>
+        <w:t xml:space="preserve"> and its performance</w:t>
+      </w:r>
+      <w:r>
+        <w:rPr>
+          <w:lang w:val="en-US"/>
+        </w:rPr>
+        <w:t xml:space="preserve"> optimizations during</w:t>
+      </w:r>
+      <w:r>
+        <w:rPr>
+          <w:lang w:val="en-US"/>
+        </w:rPr>
+        <w:t xml:space="preserve"> the previous week</w:t>
+      </w:r>
+      <w:r>
+        <w:rPr>
+          <w:lang w:val="en-US"/>
+        </w:rPr>
+        <w:t>, I updated the written thesis</w:t>
+      </w:r>
+      <w:r>
+        <w:rPr>
+          <w:lang w:val="en-US"/>
+        </w:rPr>
+        <w:t xml:space="preserve"> so that</w:t>
       </w:r>
     </w:p>
     <w:sectPr>

</xml_diff>